<commit_message>
watchdog: turn off console QuickEdit so a text selection cannot freeze runs
Selecting text in a conhost window pauses console output; _emit's print
blocked, the relay stopped draining the child's pipe, and a dev-server
cascade sat frozen at 0% CPU for 10+ minutes until Esc. Clear
ENABLE_QUICK_EDIT_MODE on the watchdog's own console at startup. Re-staged;
quick steps (md + docx) and CLAUDE.md note it.

Co-Authored-By: Claude Opus 5.5 <noreply@anthropic.com>
</commit_message>
<xml_diff>
--- a/deploy/server-2026-09/Quick Steps - Server Update 2026-09.docx
+++ b/deploy/server-2026-09/Quick Steps - Server Update 2026-09.docx
@@ -1837,6 +1837,62 @@
     </w:p>
     <w:p>
       <w:pPr>
+        <w:keepNext w:val="0"/>
+        <w:spacing w:after="80"/>
+      </w:pPr>
+      <w:r>
+        <w:rPr>
+          <w:b/>
+        </w:rPr>
+        <w:t xml:space="preserve">Copy log text from </w:t>
+      </w:r>
+      <w:r>
+        <w:rPr>
+          <w:rFonts w:ascii="Consolas" w:hAnsi="Consolas"/>
+          <w:sz w:val="20"/>
+        </w:rPr>
+        <w:t>logs\watchdog-*.log</w:t>
+      </w:r>
+      <w:r>
+        <w:rPr>
+          <w:b/>
+        </w:rPr>
+        <w:t xml:space="preserve">, not from the console. </w:t>
+      </w:r>
+      <w:r>
+        <w:t xml:space="preserve">Selecting text in a Windows console pauses all output to it, and that pause freezes the running panel or cascade until the selection is cleared — no error, no new files. The watchdog now switches this off for its own window and prints </w:t>
+      </w:r>
+      <w:r>
+        <w:rPr>
+          <w:rFonts w:ascii="Consolas" w:hAnsi="Consolas"/>
+          <w:sz w:val="20"/>
+        </w:rPr>
+        <w:t>console QuickEdit: OFF</w:t>
+      </w:r>
+      <w:r>
+        <w:t xml:space="preserve">. If a run ever stalls and the window title starts with </w:t>
+      </w:r>
+      <w:r>
+        <w:rPr>
+          <w:b/>
+        </w:rPr>
+        <w:t>Select</w:t>
+      </w:r>
+      <w:r>
+        <w:t xml:space="preserve">, press </w:t>
+      </w:r>
+      <w:r>
+        <w:rPr>
+          <w:b/>
+        </w:rPr>
+        <w:t>Esc</w:t>
+      </w:r>
+      <w:r>
+        <w:t>.</w:t>
+      </w:r>
+    </w:p>
+    <w:p>
+      <w:pPr>
         <w:keepNext/>
         <w:spacing w:after="80"/>
       </w:pPr>

</xml_diff>

<commit_message>
panel: silence the per-epoch alpha/index debug prints; ship detect_artifact.py
detect_artifact.py printed "Indexes:", retcon, Half Width, NO VAL,
Alphavals/AlphaNums and Alpha Speed for every epoch window -- the bulk of
each panel's log. Commented out (the two NO VAL prints, sole statements
of their except blocks, become pass). Print-only: panel run on
raw_130399 before/after gives a byte-identical 48-metric line.

The file was staged only as numpy>=2 insurance, so the servers still run
their own copy. Its sole other diff from production is the int32 pin,
a no-op on numpy<2, so the quick steps (md + docx) now tell every server
to deploy it, back it up, and restore it on rollback.

Co-Authored-By: Claude Opus 5.5 <noreply@anthropic.com>
</commit_message>
<xml_diff>
--- a/deploy/server-2026-09/Quick Steps - Server Update 2026-09.docx
+++ b/deploy/server-2026-09/Quick Steps - Server Update 2026-09.docx
@@ -926,6 +926,54 @@
           </w:p>
         </w:tc>
       </w:tr>
+      <w:tr>
+        <w:tc>
+          <w:tcPr>
+            <w:tcW w:type="dxa" w:w="3888"/>
+          </w:tcPr>
+          <w:p>
+            <w:pPr>
+              <w:spacing w:after="0"/>
+            </w:pPr>
+            <w:r/>
+            <w:r>
+              <w:rPr>
+                <w:rFonts w:ascii="Consolas" w:hAnsi="Consolas"/>
+                <w:sz w:val="19"/>
+              </w:rPr>
+              <w:t>staged-optional\process\detect_artifact.py</w:t>
+            </w:r>
+          </w:p>
+        </w:tc>
+        <w:tc>
+          <w:tcPr>
+            <w:tcW w:type="dxa" w:w="2448"/>
+          </w:tcPr>
+          <w:p>
+            <w:pPr>
+              <w:spacing w:after="0"/>
+            </w:pPr>
+            <w:r/>
+            <w:r>
+              <w:t>project\process\</w:t>
+            </w:r>
+          </w:p>
+        </w:tc>
+        <w:tc>
+          <w:tcPr>
+            <w:tcW w:type="dxa" w:w="3024"/>
+          </w:tcPr>
+          <w:p>
+            <w:pPr>
+              <w:spacing w:after="0"/>
+            </w:pPr>
+            <w:r/>
+            <w:r>
+              <w:t>quieter panel log; metrics unchanged</w:t>
+            </w:r>
+          </w:p>
+        </w:tc>
+      </w:tr>
     </w:tbl>
     <w:p>
       <w:pPr>
@@ -986,7 +1034,7 @@
         <w:pStyle w:val="Heading2"/>
       </w:pPr>
       <w:r>
-        <w:t>1.  Back up the six files being replaced</w:t>
+        <w:t>1.  Back up the seven files being replaced</w:t>
       </w:r>
     </w:p>
     <w:p>
@@ -1113,6 +1161,25 @@
       <w:pPr>
         <w:spacing w:after="40"/>
       </w:pPr>
+    </w:p>
+    <w:p>
+      <w:pPr>
+        <w:keepNext w:val="0"/>
+        <w:spacing w:after="120"/>
+      </w:pPr>
+      <w:r>
+        <w:t xml:space="preserve">Also copy </w:t>
+      </w:r>
+      <w:r>
+        <w:rPr>
+          <w:rFonts w:ascii="Consolas" w:hAnsi="Consolas"/>
+          <w:sz w:val="20"/>
+        </w:rPr>
+        <w:t>process\detect_artifact.py</w:t>
+      </w:r>
+      <w:r>
+        <w:t xml:space="preserve"> into the same backup folder.</w:t>
+      </w:r>
     </w:p>
     <w:p>
       <w:pPr>
@@ -1251,6 +1318,46 @@
       </w:r>
       <w:r>
         <w:t xml:space="preserve"> folder.</w:t>
+      </w:r>
+    </w:p>
+    <w:p>
+      <w:pPr>
+        <w:pStyle w:val="ListBullet"/>
+        <w:keepNext w:val="0"/>
+        <w:spacing w:after="60"/>
+        <w:ind w:left="360"/>
+      </w:pPr>
+      <w:r>
+        <w:t xml:space="preserve">Copy </w:t>
+      </w:r>
+      <w:r>
+        <w:rPr>
+          <w:rFonts w:ascii="Consolas" w:hAnsi="Consolas"/>
+          <w:sz w:val="20"/>
+        </w:rPr>
+        <w:t>staged-optional\process\detect_artifact.py</w:t>
+      </w:r>
+      <w:r>
+        <w:t xml:space="preserve"> into the project’s </w:t>
+      </w:r>
+      <w:r>
+        <w:rPr>
+          <w:rFonts w:ascii="Consolas" w:hAnsi="Consolas"/>
+          <w:sz w:val="20"/>
+        </w:rPr>
+        <w:t>process\</w:t>
+      </w:r>
+      <w:r>
+        <w:t xml:space="preserve"> folder too, and say </w:t>
+      </w:r>
+      <w:r>
+        <w:rPr>
+          <w:b/>
+        </w:rPr>
+        <w:t>Yes</w:t>
+      </w:r>
+      <w:r>
+        <w:t xml:space="preserve"> to overwrite. It silences the alpha debug prints that flood the panel log; all 48 metrics were verified identical.</w:t>
       </w:r>
     </w:p>
     <w:p>
@@ -2310,17 +2417,17 @@
         <w:t>tens of thousands</w:t>
       </w:r>
       <w:r>
-        <w:t xml:space="preserve">: that server has numpy 2.x. Also paste </w:t>
+        <w:t xml:space="preserve">: that server has numpy 2.x and </w:t>
       </w:r>
       <w:r>
         <w:rPr>
           <w:rFonts w:ascii="Consolas" w:hAnsi="Consolas"/>
           <w:sz w:val="20"/>
         </w:rPr>
-        <w:t>staged-optional\process\detect_artifact.py</w:t>
+        <w:t>detect_artifact.py</w:t>
       </w:r>
       <w:r>
-        <w:t xml:space="preserve"> into the project’s </w:t>
+        <w:t xml:space="preserve"> from step 2 did not land in </w:t>
       </w:r>
       <w:r>
         <w:rPr>
@@ -2330,7 +2437,7 @@
         <w:t>process\</w:t>
       </w:r>
       <w:r>
-        <w:t xml:space="preserve"> folder and re-run the study. One-time check per server.</w:t>
+        <w:t>. Copy it and re-run the study.</w:t>
       </w:r>
     </w:p>
     <w:p>
@@ -2363,7 +2470,7 @@
         <w:spacing w:after="80"/>
       </w:pPr>
       <w:r>
-        <w:t xml:space="preserve">Copy the six files from </w:t>
+        <w:t xml:space="preserve">Copy the files from </w:t>
       </w:r>
       <w:r>
         <w:rPr>
@@ -2373,7 +2480,27 @@
         <w:t>backup-2026-09</w:t>
       </w:r>
       <w:r>
-        <w:t xml:space="preserve"> back into </w:t>
+        <w:t xml:space="preserve"> back: </w:t>
+      </w:r>
+      <w:r>
+        <w:rPr>
+          <w:rFonts w:ascii="Consolas" w:hAnsi="Consolas"/>
+          <w:sz w:val="20"/>
+        </w:rPr>
+        <w:t>detect_artifact.py</w:t>
+      </w:r>
+      <w:r>
+        <w:t xml:space="preserve"> into </w:t>
+      </w:r>
+      <w:r>
+        <w:rPr>
+          <w:rFonts w:ascii="Consolas" w:hAnsi="Consolas"/>
+          <w:sz w:val="20"/>
+        </w:rPr>
+        <w:t>process\</w:t>
+      </w:r>
+      <w:r>
+        <w:t xml:space="preserve">, the other six into </w:t>
       </w:r>
       <w:r>
         <w:rPr>

</xml_diff>

<commit_message>
﻿watchdog: write the console from its own thread so a selection cannot stall a study
Turning QuickEdit off stopped mouse selections, but Ctrl+A still selects the
whole console and froze the dev server again the same day. _emit now queues
console lines to a writer thread (bounded at 20000; overflow is dropped from
the console only and reported when it resumes). The log file is still written
synchronously and gets every line. Tested with a blocked stdout: 30000 lines
emitted in 0.23 s, all 30000 in the log.

Updates the staged checksum, QUICK_STEPS size and console note, the Quick
Steps docx, CLAUDE.md, and the root copy of the watchdog.

Co-Authored-By: Claude Opus 5.5 <noreply@anthropic.com>
</commit_message>
<xml_diff>
--- a/deploy/server-2026-09/Quick Steps - Server Update 2026-09.docx
+++ b/deploy/server-2026-09/Quick Steps - Server Update 2026-09.docx
@@ -1967,7 +1967,7 @@
         <w:t xml:space="preserve">, not from the console. </w:t>
       </w:r>
       <w:r>
-        <w:t xml:space="preserve">Selecting text in a Windows console pauses all output to it, and that pause freezes the running panel or cascade until the selection is cleared — no error, no new files. The watchdog now switches this off for its own window and prints </w:t>
+        <w:t xml:space="preserve">Selecting text in a Windows console pauses all output to it, and that pause freezes the running panel or cascade until the selection is cleared — no error, no new files. The watchdog now switches this off for its own window (it prints </w:t>
       </w:r>
       <w:r>
         <w:rPr>
@@ -1977,7 +1977,16 @@
         <w:t>console QuickEdit: OFF</w:t>
       </w:r>
       <w:r>
-        <w:t xml:space="preserve">. If a run ever stalls and the window title starts with </w:t>
+        <w:t xml:space="preserve">) and writes to the console from a separate thread, so even a Ctrl+A selection only pauses the window: the study keeps running and the log keeps every line. Clear a selection with </w:t>
+      </w:r>
+      <w:r>
+        <w:rPr>
+          <w:b/>
+        </w:rPr>
+        <w:t>Esc</w:t>
+      </w:r>
+      <w:r>
+        <w:t xml:space="preserve"> (title starts with </w:t>
       </w:r>
       <w:r>
         <w:rPr>
@@ -1986,16 +1995,7 @@
         <w:t>Select</w:t>
       </w:r>
       <w:r>
-        <w:t xml:space="preserve">, press </w:t>
-      </w:r>
-      <w:r>
-        <w:rPr>
-          <w:b/>
-        </w:rPr>
-        <w:t>Esc</w:t>
-      </w:r>
-      <w:r>
-        <w:t>.</w:t>
+        <w:t>). Never press Ctrl+C there with nothing selected — it stops the watchdog and the running study.</w:t>
       </w:r>
     </w:p>
     <w:p>

</xml_diff>

<commit_message>
deploy: record the 2026-09 server update as live on production
Production switched to tomwatchdog_serialized.py and the staged set on
2026-10-08 15:24; first study verified (Global STD 2.52, Moment 3 in range,
42-page cascade with no black pages, brain pages rendering).

- DEPLOYED.md: what went onto dev and production, startup commands, the
  verification results, rollback, and what to watch. Studies are cited by
  neutral label, as on main.
- Quick steps (md/docx/pdf): production has no py launcher; give the
  full Python312 path.
- CLAUDE.md: production no longer matches d4f522c; Global STD fixed on
  both servers; cascades live; document the (line) marking.

Co-Authored-By: Claude Opus 5.5 <noreply@anthropic.com>
</commit_message>
<xml_diff>
--- a/deploy/server-2026-09/Quick Steps - Server Update 2026-09.docx
+++ b/deploy/server-2026-09/Quick Steps - Server Update 2026-09.docx
@@ -1659,6 +1659,61 @@
     </w:p>
     <w:p>
       <w:pPr>
+        <w:keepNext/>
+        <w:spacing w:after="40"/>
+      </w:pPr>
+      <w:r>
+        <w:t xml:space="preserve">If the window answers </w:t>
+      </w:r>
+      <w:r>
+        <w:rPr>
+          <w:rFonts w:ascii="Consolas" w:hAnsi="Consolas"/>
+          <w:sz w:val="20"/>
+        </w:rPr>
+        <w:t>'py' is not recognized</w:t>
+      </w:r>
+      <w:r>
+        <w:t xml:space="preserve"> (production has no py launcher), run the same Python by its full path instead — on production:</w:t>
+      </w:r>
+    </w:p>
+    <w:tbl>
+      <w:tblPr>
+        <w:tblW w:type="auto" w:w="0"/>
+        <w:jc w:val="center"/>
+        <w:tblLook w:firstColumn="1" w:firstRow="1" w:lastColumn="0" w:lastRow="0" w:noHBand="0" w:noVBand="1" w:val="04A0"/>
+      </w:tblPr>
+      <w:tblGrid>
+        <w:gridCol w:w="9360"/>
+      </w:tblGrid>
+      <w:tr>
+        <w:tc>
+          <w:tcPr>
+            <w:tcW w:type="dxa" w:w="9360"/>
+            <w:shd w:val="clear" w:color="auto" w:fill="F2F2F2"/>
+          </w:tcPr>
+          <w:p>
+            <w:pPr>
+              <w:spacing w:after="0"/>
+            </w:pPr>
+            <w:r/>
+            <w:r>
+              <w:rPr>
+                <w:rFonts w:ascii="Consolas" w:hAnsi="Consolas"/>
+                <w:sz w:val="20"/>
+              </w:rPr>
+              <w:t>c:\users\tcollura\appdata\local\programs\python\python312\python tomwatchdog_serialized.py</w:t>
+            </w:r>
+          </w:p>
+        </w:tc>
+      </w:tr>
+    </w:tbl>
+    <w:p>
+      <w:pPr>
+        <w:spacing w:after="40"/>
+      </w:pPr>
+    </w:p>
+    <w:p>
+      <w:pPr>
         <w:keepNext w:val="0"/>
         <w:spacing w:after="80"/>
       </w:pPr>
@@ -2725,7 +2780,7 @@
         <w:color w:val="808080"/>
         <w:sz w:val="16"/>
       </w:rPr>
-      <w:t>deploy\server-2026-09\Quick Steps  —  built from production source, verified 2026-09-29</w:t>
+      <w:t>deploy\server-2026-09\Quick Steps  —  built from production source, deployed to production 2026-10-08</w:t>
     </w:r>
   </w:p>
 </w:ftr>

</xml_diff>